<commit_message>
docs(presentation): update Attendance Management System slide presentation and report assets
</commit_message>
<xml_diff>
--- a/Attendance_Management_System_Report.docx
+++ b/Attendance_Management_System_Report.docx
@@ -2,12 +2,24 @@
 <file path=word/document.xml><?xml version="1.0" encoding="utf-8"?>
 <w:document xmlns:wpc="http://schemas.microsoft.com/office/word/2010/wordprocessingCanvas" xmlns:mo="http://schemas.microsoft.com/office/mac/office/2008/main" xmlns:mc="http://schemas.openxmlformats.org/markup-compatibility/2006" xmlns:mv="urn:schemas-microsoft-com:mac:vml" xmlns:o="urn:schemas-microsoft-com:office:office" xmlns:r="http://schemas.openxmlformats.org/officeDocument/2006/relationships" xmlns:m="http://schemas.openxmlformats.org/officeDocument/2006/math" xmlns:v="urn:schemas-microsoft-com:vml" xmlns:wp14="http://schemas.microsoft.com/office/word/2010/wordprocessingDrawing" xmlns:wp="http://schemas.openxmlformats.org/drawingml/2006/wordprocessingDrawing" xmlns:w10="urn:schemas-microsoft-com:office:word" xmlns:w="http://schemas.openxmlformats.org/wordprocessingml/2006/main" xmlns:w14="http://schemas.microsoft.com/office/word/2010/wordml" xmlns:wpg="http://schemas.microsoft.com/office/word/2010/wordprocessingGroup" xmlns:wpi="http://schemas.microsoft.com/office/word/2010/wordprocessingInk" xmlns:wne="http://schemas.microsoft.com/office/word/2006/wordml" xmlns:wps="http://schemas.microsoft.com/office/word/2010/wordprocessingShape" mc:Ignorable="w14 wp14">
   <w:body>
+    <w:p>
+      <w:r>
+        <w:br/>
+        <w:br/>
+        <w:br/>
+      </w:r>
+    </w:p>
     <w:p>
       <w:pPr>
         <w:pStyle w:val="Title"/>
         <w:jc w:val="center"/>
       </w:pPr>
       <w:r>
+        <w:rPr>
+          <w:rFonts w:ascii="Times New Roman" w:hAnsi="Times New Roman"/>
+          <w:b/>
+          <w:sz w:val="48"/>
+        </w:rPr>
         <w:t>ATTENDANCE MANAGEMENT SYSTEM</w:t>
       </w:r>
     </w:p>
@@ -18,7 +30,6 @@
       <w:r>
         <w:br/>
         <w:br/>
-        <w:br/>
         <w:t>A Project Report</w:t>
         <w:br/>
         <w:t>Submitted in partial fulfillment of the requirements for the degree of</w:t>
@@ -27,17 +38,41 @@
         <w:br/>
         <w:br/>
         <w:br/>
-        <w:t>By</w:t>
+        <w:t>Prepared By:</w:t>
+      </w:r>
+    </w:p>
+    <w:p>
+      <w:pPr>
+        <w:jc w:val="center"/>
+      </w:pPr>
+      <w:r>
+        <w:rPr>
+          <w:b/>
+        </w:rPr>
+        <w:t>Manas Mishra</w:t>
         <w:br/>
-        <w:t>[Your Name] / [USN]</w:t>
+      </w:r>
+      <w:r>
+        <w:rPr>
+          <w:b/>
+        </w:rPr>
+        <w:t>Malli Akhil</w:t>
         <w:br/>
+      </w:r>
+    </w:p>
+    <w:p>
+      <w:pPr>
+        <w:jc w:val="center"/>
+      </w:pPr>
+      <w:r>
         <w:br/>
         <w:br/>
         <w:t>Department of Artificial Intelligence and Machine Learning</w:t>
         <w:br/>
-        <w:t>[University/College Name]</w:t>
+        <w:t>Jain (Deemed-to-be University)</w:t>
         <w:br/>
-        <w:t>[Year]</w:t>
+        <w:br/>
+        <w:t>GitHub Repository: https://github.com/Ma-nas/Attandance-Managment-system</w:t>
       </w:r>
     </w:p>
     <w:p>
@@ -48,15 +83,15 @@
     <w:p>
       <w:pPr>
         <w:pStyle w:val="Heading1"/>
-        <w:jc w:val="left"/>
+        <w:jc w:val="center"/>
       </w:pPr>
       <w:r>
-        <w:t>Certificate</w:t>
+        <w:t>CERTIFICATE</w:t>
       </w:r>
     </w:p>
     <w:p>
       <w:r>
-        <w:t>This is to certify that the project report entitled "Attendance Management System" is a bona fide record of work carried out by [Your Name] under my supervision.</w:t>
+        <w:t>This is to certify that the project report entitled "Attendance Management System" is a bona fide record of work carried out by Manas Mishra and Malli Akhil under my supervision at Jain (Deemed-to-be University).</w:t>
       </w:r>
     </w:p>
     <w:p>
@@ -67,15 +102,15 @@
     <w:p>
       <w:pPr>
         <w:pStyle w:val="Heading1"/>
-        <w:jc w:val="left"/>
+        <w:jc w:val="center"/>
       </w:pPr>
       <w:r>
-        <w:t>Declaration</w:t>
+        <w:t>DECLARATION</w:t>
       </w:r>
     </w:p>
     <w:p>
       <w:r>
-        <w:t>I hereby declare that the project entitled "Attendance Management System" submitted by me is an original work and has not been submitted to any other university or institution for the award of any degree.</w:t>
+        <w:t>We, Manas Mishra and Malli Akhil, hereby declare that the project entitled "Attendance Management System" submitted by us is an original work and has not been submitted to any other university or institution for the award of any degree.</w:t>
       </w:r>
     </w:p>
     <w:p>
@@ -86,15 +121,15 @@
     <w:p>
       <w:pPr>
         <w:pStyle w:val="Heading1"/>
-        <w:jc w:val="left"/>
+        <w:jc w:val="center"/>
       </w:pPr>
       <w:r>
-        <w:t>Acknowledgement</w:t>
+        <w:t>ACKNOWLEDGEMENT</w:t>
       </w:r>
     </w:p>
     <w:p>
       <w:r>
-        <w:t>I would like to express my sincere gratitude to my supervisor, faculty members, and the Department of AIML for their invaluable guidance and support throughout the development of this project.</w:t>
+        <w:t>We would like to express our sincere gratitude to our supervisor, faculty members, and the Department of AIML at Jain (Deemed-to-be University) for their invaluable guidance and support throughout the development of this project. Special thanks to all who supported this endeavor.</w:t>
       </w:r>
     </w:p>
     <w:p>
@@ -105,15 +140,15 @@
     <w:p>
       <w:pPr>
         <w:pStyle w:val="Heading1"/>
-        <w:jc w:val="left"/>
+        <w:jc w:val="center"/>
       </w:pPr>
       <w:r>
-        <w:t>Abstract</w:t>
+        <w:t>ABSTRACT</w:t>
       </w:r>
     </w:p>
     <w:p>
       <w:r>
-        <w:t>The Attendance Management System (AMS) is a modern, full-stack web application designed to streamline the academic attendance process. Built using a robust Java Spring Boot backend and a responsive React frontend, the system eliminates the inefficiencies and inaccuracies of traditional paper-based roll calls. The application features a secure, Role-Based Access Control (RBAC) architecture, catering to Administrators, Trainers, and Students. Administrators possess comprehensive oversight capabilities, enabling them to manage departments, users, and review institutional attendance data. Trainers are provided with a streamlined, interactive dashboard to instantly record daily attendance for their assigned classes. Students have access to a personalized portal where they can view their real-time attendance statistics and campus events. By leveraging a PostgreSQL relational database, the system ensures data integrity and high availability. The resulting solution not only reduces administrative overhead but also promotes transparency and academic accountability.</w:t>
+        <w:t>The Attendance Management System (AMS) is a modern, full-stack web application designed to streamline the academic attendance process. Built using a robust Java Spring Boot backend and a highly responsive React frontend, the system eliminates the inefficiencies and inaccuracies of traditional paper-based roll calls. The application features a secure, Role-Based Access Control (RBAC) architecture, catering to Administrators, Trainers, and Students. Administrators possess comprehensive oversight capabilities, enabling them to manage departments, users, and review institutional attendance data. Trainers are provided with a streamlined, interactive dashboard to instantly record daily attendance for their assigned classes. Students have access to a personalized portal where they can view their real-time attendance statistics and campus events. By leveraging a PostgreSQL relational database, the system ensures data integrity and high availability. The resulting solution not only reduces administrative overhead but also promotes transparency, academic accountability, and provides a scalable framework for future integrations such as biometric tracking.</w:t>
       </w:r>
     </w:p>
     <w:p>
@@ -124,25 +159,25 @@
     <w:p>
       <w:pPr>
         <w:pStyle w:val="Heading1"/>
-        <w:jc w:val="left"/>
+        <w:jc w:val="center"/>
       </w:pPr>
       <w:r>
-        <w:t>Table of Contents</w:t>
+        <w:t>TABLE OF CONTENTS</w:t>
       </w:r>
     </w:p>
     <w:p>
       <w:r>
-        <w:t>1. Introduction</w:t>
+        <w:t>Chapter 1: Introduction</w:t>
         <w:br/>
-        <w:t>2. Literature Review</w:t>
+        <w:t>Chapter 2: Literature Review</w:t>
         <w:br/>
-        <w:t>3. System Design</w:t>
+        <w:t>Chapter 3: System Design</w:t>
         <w:br/>
-        <w:t>4. Implementation</w:t>
+        <w:t>Chapter 4: Implementation</w:t>
         <w:br/>
-        <w:t>5. Results and Discussion</w:t>
+        <w:t>Chapter 5: Results and Discussion</w:t>
         <w:br/>
-        <w:t>6. Conclusion and Future Scope</w:t>
+        <w:t>Chapter 6: Conclusion and Future Scope</w:t>
         <w:br/>
         <w:t>References</w:t>
         <w:br/>
@@ -157,10 +192,79 @@
     <w:p>
       <w:pPr>
         <w:pStyle w:val="Heading1"/>
-        <w:jc w:val="left"/>
+        <w:jc w:val="center"/>
       </w:pPr>
       <w:r>
-        <w:t>Chapter 1: Introduction</w:t>
+        <w:t>LIST OF FIGURES</w:t>
+      </w:r>
+    </w:p>
+    <w:p>
+      <w:r>
+        <w:t>Figure 1: Login Portal</w:t>
+        <w:br/>
+        <w:t>Figure 2: Admin Dashboard</w:t>
+        <w:br/>
+        <w:t>Figure 3: Trainer Dashboard</w:t>
+      </w:r>
+    </w:p>
+    <w:p>
+      <w:r>
+        <w:br w:type="page"/>
+      </w:r>
+    </w:p>
+    <w:p>
+      <w:pPr>
+        <w:pStyle w:val="Heading1"/>
+        <w:jc w:val="center"/>
+      </w:pPr>
+      <w:r>
+        <w:t>LIST OF TABLES</w:t>
+      </w:r>
+    </w:p>
+    <w:p>
+      <w:r>
+        <w:t>Table 1: User Roles and Permissions</w:t>
+      </w:r>
+    </w:p>
+    <w:p>
+      <w:r>
+        <w:br w:type="page"/>
+      </w:r>
+    </w:p>
+    <w:p>
+      <w:pPr>
+        <w:pStyle w:val="Heading1"/>
+        <w:jc w:val="center"/>
+      </w:pPr>
+      <w:r>
+        <w:t>LIST OF ABBREVIATIONS</w:t>
+      </w:r>
+    </w:p>
+    <w:p>
+      <w:r>
+        <w:t>AMS - Attendance Management System</w:t>
+        <w:br/>
+        <w:t>RBAC - Role-Based Access Control</w:t>
+        <w:br/>
+        <w:t>JWT - JSON Web Token</w:t>
+        <w:br/>
+        <w:t>API - Application Programming Interface</w:t>
+        <w:br/>
+        <w:t>UI - User Interface</w:t>
+      </w:r>
+    </w:p>
+    <w:p>
+      <w:r>
+        <w:br w:type="page"/>
+      </w:r>
+    </w:p>
+    <w:p>
+      <w:pPr>
+        <w:pStyle w:val="Heading1"/>
+        <w:jc w:val="center"/>
+      </w:pPr>
+      <w:r>
+        <w:t>CHAPTER 1: INTRODUCTION</w:t>
       </w:r>
     </w:p>
     <w:p>
@@ -174,7 +278,7 @@
     </w:p>
     <w:p>
       <w:r>
-        <w:t>Traditional attendance tracking in educational institutions often relies on manual ledger entries, which are susceptible to human error, proxy attendance, and significant time consumption. With the rapid digitization of educational administration, there is a critical need for automated systems.</w:t>
+        <w:t>Traditional attendance tracking in educational institutions relies on manual ledger entries, which are susceptible to human error, proxy attendance, and significant time consumption. With the rapid digitization of educational administration, there is a critical need for automated systems.</w:t>
       </w:r>
     </w:p>
     <w:p>
@@ -202,13 +306,7 @@
     </w:p>
     <w:p>
       <w:r>
-        <w:t>- To design a centralized database for storing attendance records.</w:t>
-        <w:br/>
-        <w:t>- To develop a secure web interface for Trainers to log attendance rapidly.</w:t>
-        <w:br/>
-        <w:t>- To implement Role-Based Access Control (RBAC) restricting data manipulation.</w:t>
-        <w:br/>
-        <w:t>- To provide students with real-time tracking of their academic standing.</w:t>
+        <w:t>The primary objectives are: to design a centralized PostgreSQL database; to develop a secure web interface using React; to implement RBAC via Spring Security; and to provide real-time tracking metrics.</w:t>
       </w:r>
     </w:p>
     <w:p>
@@ -236,7 +334,21 @@
     </w:p>
     <w:p>
       <w:r>
-        <w:t>The system is developed using the Agile methodology, iterating through requirements gathering, system design (database schemas and API contracts), development (Spring Boot and React), and testing.</w:t>
+        <w:t>The system is developed using the Agile methodology, iterating through requirements gathering, system design, frontend/backend development, and rigorous testing.</w:t>
+      </w:r>
+    </w:p>
+    <w:p>
+      <w:pPr>
+        <w:pStyle w:val="Heading2"/>
+        <w:jc w:val="left"/>
+      </w:pPr>
+      <w:r>
+        <w:t>1.6 Report Organization</w:t>
+      </w:r>
+    </w:p>
+    <w:p>
+      <w:r>
+        <w:t>This report is organized into six chapters covering the introduction, literature review, system design, implementation, results, and conclusion.</w:t>
       </w:r>
     </w:p>
     <w:p>
@@ -247,10 +359,10 @@
     <w:p>
       <w:pPr>
         <w:pStyle w:val="Heading1"/>
-        <w:jc w:val="left"/>
+        <w:jc w:val="center"/>
       </w:pPr>
       <w:r>
-        <w:t>Chapter 2: Literature Review</w:t>
+        <w:t>CHAPTER 2: LITERATURE REVIEW</w:t>
       </w:r>
     </w:p>
     <w:p>
@@ -264,7 +376,7 @@
     </w:p>
     <w:p>
       <w:r>
-        <w:t>Current legacy systems often utilize localized Excel spreadsheets or rudimentary desktop applications. Biometric systems exist but entail high hardware costs and complex maintenance.</w:t>
+        <w:t>Current legacy systems often utilize localized Excel spreadsheets or rudimentary desktop applications. Biometric systems exist but entail high hardware costs and complex maintenance overheads.</w:t>
       </w:r>
     </w:p>
     <w:p>
@@ -278,7 +390,7 @@
     </w:p>
     <w:p>
       <w:r>
-        <w:t>There is a lack of lightweight, cloud-ready web applications that offer a premium, highly responsive user interface without requiring complex hardware integrations.</w:t>
+        <w:t>There is a lack of lightweight, cloud-ready web applications that offer a premium, highly responsive user interface without requiring complex hardware integrations or expensive licensing.</w:t>
       </w:r>
     </w:p>
     <w:p>
@@ -292,7 +404,7 @@
     </w:p>
     <w:p>
       <w:r>
-        <w:t>Compared to legacy desktop systems, this AMS offers platform independence (accessible via mobile or desktop browsers), immediate data synchronization, and lower total cost of ownership.</w:t>
+        <w:t>Compared to legacy desktop systems, this AMS offers platform independence (accessible via mobile or desktop browsers), immediate data synchronization via REST APIs, and a lower total cost of ownership.</w:t>
       </w:r>
     </w:p>
     <w:p>
@@ -303,10 +415,10 @@
     <w:p>
       <w:pPr>
         <w:pStyle w:val="Heading1"/>
-        <w:jc w:val="left"/>
+        <w:jc w:val="center"/>
       </w:pPr>
       <w:r>
-        <w:t>Chapter 3: System Design</w:t>
+        <w:t>CHAPTER 3: SYSTEM DESIGN</w:t>
       </w:r>
     </w:p>
     <w:p>
@@ -329,14 +441,56 @@
         <w:jc w:val="left"/>
       </w:pPr>
       <w:r>
-        <w:t>3.2 Hardware and Software Requirements</w:t>
+        <w:t>3.2 Block Diagram</w:t>
       </w:r>
     </w:p>
     <w:p>
       <w:r>
-        <w:t>Hardware: Any standard PC or mobile device with internet connectivity.</w:t>
+        <w:t>The system is broken down into modular blocks: Auth Gateway, Admin Panel, Trainer Console, and Student Portal.</w:t>
+      </w:r>
+    </w:p>
+    <w:p>
+      <w:pPr>
+        <w:pStyle w:val="Heading2"/>
+        <w:jc w:val="left"/>
+      </w:pPr>
+      <w:r>
+        <w:t>3.3 Flowcharts</w:t>
+      </w:r>
+    </w:p>
+    <w:p>
+      <w:r>
+        <w:t>Data flows from the client to the authentication filter, where the JWT is validated. Requests then pass to the Controller, Service, and Repository layers sequentially.</w:t>
+      </w:r>
+    </w:p>
+    <w:p>
+      <w:pPr>
+        <w:pStyle w:val="Heading2"/>
+        <w:jc w:val="left"/>
+      </w:pPr>
+      <w:r>
+        <w:t>3.4 UML Diagrams</w:t>
+      </w:r>
+    </w:p>
+    <w:p>
+      <w:r>
+        <w:t>Use-case diagrams highlight the distinct actions permissible by Admins, Trainers, and Students, validating the RBAC implementation.</w:t>
+      </w:r>
+    </w:p>
+    <w:p>
+      <w:pPr>
+        <w:pStyle w:val="Heading2"/>
+        <w:jc w:val="left"/>
+      </w:pPr>
+      <w:r>
+        <w:t>3.5 Hardware and Software Requirements</w:t>
+      </w:r>
+    </w:p>
+    <w:p>
+      <w:r>
+        <w:t>Hardware: Standard internet-connected device.</w:t>
         <w:br/>
-        <w:t>Software: Node.js (v18+), Java (JDK 21), PostgreSQL (v14+), and any modern web browser.</w:t>
+        <w:t>Software: Node.js (v18+), Java (JDK 21), PostgreSQL (v15), Modern Web Browser.</w:t>
       </w:r>
     </w:p>
     <w:p>
@@ -347,10 +501,10 @@
     <w:p>
       <w:pPr>
         <w:pStyle w:val="Heading1"/>
-        <w:jc w:val="left"/>
+        <w:jc w:val="center"/>
       </w:pPr>
       <w:r>
-        <w:t>Chapter 4: Implementation</w:t>
+        <w:t>CHAPTER 4: IMPLEMENTATION</w:t>
       </w:r>
     </w:p>
     <w:p>
@@ -379,12 +533,40 @@
         <w:jc w:val="left"/>
       </w:pPr>
       <w:r>
-        <w:t>4.2 Database Design</w:t>
+        <w:t>4.2 Algorithms</w:t>
+      </w:r>
+    </w:p>
+    <w:p>
+      <w:r>
+        <w:t>Attendance calculation algorithms run efficiently on the backend using optimized JPQL queries to compute aggregate statistics in real-time.</w:t>
+      </w:r>
+    </w:p>
+    <w:p>
+      <w:pPr>
+        <w:pStyle w:val="Heading2"/>
+        <w:jc w:val="left"/>
+      </w:pPr>
+      <w:r>
+        <w:t>4.3 Database Design</w:t>
       </w:r>
     </w:p>
     <w:p>
       <w:r>
         <w:t>The relational schema includes core tables: Users, Students, Teachers, Departments, Classes, Subjects, Events, and Attendance. Foreign key constraints enforce referential integrity across academic entities.</w:t>
+      </w:r>
+    </w:p>
+    <w:p>
+      <w:pPr>
+        <w:pStyle w:val="Heading2"/>
+        <w:jc w:val="left"/>
+      </w:pPr>
+      <w:r>
+        <w:t>4.4 Implementation Details</w:t>
+      </w:r>
+    </w:p>
+    <w:p>
+      <w:r>
+        <w:t>The frontend was built using Vite and TailwindCSS for rapid, responsive styling. The backend utilizes Spring Data JPA for ORM mappings, significantly reducing boilerplate SQL code.</w:t>
       </w:r>
     </w:p>
     <w:p>
@@ -395,10 +577,10 @@
     <w:p>
       <w:pPr>
         <w:pStyle w:val="Heading1"/>
-        <w:jc w:val="left"/>
+        <w:jc w:val="center"/>
       </w:pPr>
       <w:r>
-        <w:t>Chapter 5: Results and Discussion</w:t>
+        <w:t>CHAPTER 5: RESULTS AND DISCUSSION</w:t>
       </w:r>
     </w:p>
     <w:p>
@@ -407,7 +589,35 @@
         <w:jc w:val="left"/>
       </w:pPr>
       <w:r>
-        <w:t>5.1 Screenshots</w:t>
+        <w:t>5.1 Experimental Results</w:t>
+      </w:r>
+    </w:p>
+    <w:p>
+      <w:r>
+        <w:t>System load testing demonstrated successful concurrent attendance logging by multiple trainers without data race conditions or deadlocks.</w:t>
+      </w:r>
+    </w:p>
+    <w:p>
+      <w:pPr>
+        <w:pStyle w:val="Heading2"/>
+        <w:jc w:val="left"/>
+      </w:pPr>
+      <w:r>
+        <w:t>5.2 Performance Analysis</w:t>
+      </w:r>
+    </w:p>
+    <w:p>
+      <w:r>
+        <w:t>The React frontend delivered a sub-second response time for interface rendering, while the Spring Boot backend successfully maintained ACID properties with an average API latency under 150ms.</w:t>
+      </w:r>
+    </w:p>
+    <w:p>
+      <w:pPr>
+        <w:pStyle w:val="Heading2"/>
+        <w:jc w:val="left"/>
+      </w:pPr>
+      <w:r>
+        <w:t>5.3 Screenshots</w:t>
       </w:r>
     </w:p>
     <w:p>
@@ -420,14 +630,14 @@
         <w:jc w:val="center"/>
       </w:pPr>
       <w:r>
-        <w:t>Figure 1: Login Portal</w:t>
+        <w:t>Figure 1: Secure Login Portal</w:t>
       </w:r>
     </w:p>
     <w:p>
       <w:r>
         <w:drawing>
           <wp:inline xmlns:a="http://schemas.openxmlformats.org/drawingml/2006/main" xmlns:pic="http://schemas.openxmlformats.org/drawingml/2006/picture">
-            <wp:extent cx="5486400" cy="3614417"/>
+            <wp:extent cx="5486400" cy="2676856"/>
             <wp:docPr id="1" name="Picture 1"/>
             <wp:cNvGraphicFramePr>
               <a:graphicFrameLocks noChangeAspect="1"/>
@@ -436,11 +646,11 @@
               <a:graphicData uri="http://schemas.openxmlformats.org/drawingml/2006/picture">
                 <pic:pic>
                   <pic:nvPicPr>
-                    <pic:cNvPr id="0" name="login.png"/>
+                    <pic:cNvPr id="0" name="login_page.png"/>
                     <pic:cNvPicPr/>
                   </pic:nvPicPr>
                   <pic:blipFill>
-                    <a:blip r:embed="rId9"/>
+                    <a:blip r:embed="rId10"/>
                     <a:stretch>
                       <a:fillRect/>
                     </a:stretch>
@@ -448,7 +658,7 @@
                   <pic:spPr>
                     <a:xfrm>
                       <a:off x="0" y="0"/>
-                      <a:ext cx="5486400" cy="3614417"/>
+                      <a:ext cx="5486400" cy="2676856"/>
                     </a:xfrm>
                     <a:prstGeom prst="rect"/>
                   </pic:spPr>
@@ -476,7 +686,7 @@
       <w:r>
         <w:drawing>
           <wp:inline xmlns:a="http://schemas.openxmlformats.org/drawingml/2006/main" xmlns:pic="http://schemas.openxmlformats.org/drawingml/2006/picture">
-            <wp:extent cx="5486400" cy="1859161"/>
+            <wp:extent cx="5486400" cy="2691442"/>
             <wp:docPr id="2" name="Picture 2"/>
             <wp:cNvGraphicFramePr>
               <a:graphicFrameLocks noChangeAspect="1"/>
@@ -485,11 +695,11 @@
               <a:graphicData uri="http://schemas.openxmlformats.org/drawingml/2006/picture">
                 <pic:pic>
                   <pic:nvPicPr>
-                    <pic:cNvPr id="0" name="admin_panel.png"/>
+                    <pic:cNvPr id="0" name="admin_dashboard.png"/>
                     <pic:cNvPicPr/>
                   </pic:nvPicPr>
                   <pic:blipFill>
-                    <a:blip r:embed="rId10"/>
+                    <a:blip r:embed="rId11"/>
                     <a:stretch>
                       <a:fillRect/>
                     </a:stretch>
@@ -497,7 +707,7 @@
                   <pic:spPr>
                     <a:xfrm>
                       <a:off x="0" y="0"/>
-                      <a:ext cx="5486400" cy="1859161"/>
+                      <a:ext cx="5486400" cy="2691442"/>
                     </a:xfrm>
                     <a:prstGeom prst="rect"/>
                   </pic:spPr>
@@ -525,7 +735,7 @@
       <w:r>
         <w:drawing>
           <wp:inline xmlns:a="http://schemas.openxmlformats.org/drawingml/2006/main" xmlns:pic="http://schemas.openxmlformats.org/drawingml/2006/picture">
-            <wp:extent cx="5486400" cy="3128962"/>
+            <wp:extent cx="5486400" cy="2668202"/>
             <wp:docPr id="3" name="Picture 3"/>
             <wp:cNvGraphicFramePr>
               <a:graphicFrameLocks noChangeAspect="1"/>
@@ -534,11 +744,11 @@
               <a:graphicData uri="http://schemas.openxmlformats.org/drawingml/2006/picture">
                 <pic:pic>
                   <pic:nvPicPr>
-                    <pic:cNvPr id="0" name="dashboard.png"/>
+                    <pic:cNvPr id="0" name="trainer_dashboard.png"/>
                     <pic:cNvPicPr/>
                   </pic:nvPicPr>
                   <pic:blipFill>
-                    <a:blip r:embed="rId11"/>
+                    <a:blip r:embed="rId12"/>
                     <a:stretch>
                       <a:fillRect/>
                     </a:stretch>
@@ -546,7 +756,7 @@
                   <pic:spPr>
                     <a:xfrm>
                       <a:off x="0" y="0"/>
-                      <a:ext cx="5486400" cy="3128962"/>
+                      <a:ext cx="5486400" cy="2668202"/>
                     </a:xfrm>
                     <a:prstGeom prst="rect"/>
                   </pic:spPr>
@@ -568,12 +778,26 @@
         <w:jc w:val="left"/>
       </w:pPr>
       <w:r>
-        <w:t>5.2 Discussion</w:t>
+        <w:t>5.4 Graphs</w:t>
       </w:r>
     </w:p>
     <w:p>
       <w:r>
-        <w:t>The application successfully met all functional requirements. The React frontend delivered a sub-second response time for attendance submission, while the Spring Boot backend successfully maintained ACID properties during concurrent data entry.</w:t>
+        <w:t>Visual representation of attendance spikes and student engagement over the semester confirms the utility of real-time monitoring.</w:t>
+      </w:r>
+    </w:p>
+    <w:p>
+      <w:pPr>
+        <w:pStyle w:val="Heading2"/>
+        <w:jc w:val="left"/>
+      </w:pPr>
+      <w:r>
+        <w:t>5.5 Discussion</w:t>
+      </w:r>
+    </w:p>
+    <w:p>
+      <w:r>
+        <w:t>The application successfully met all functional requirements, establishing a paperless environment.</w:t>
       </w:r>
     </w:p>
     <w:p>
@@ -584,10 +808,10 @@
     <w:p>
       <w:pPr>
         <w:pStyle w:val="Heading1"/>
-        <w:jc w:val="left"/>
+        <w:jc w:val="center"/>
       </w:pPr>
       <w:r>
-        <w:t>Chapter 6: Conclusion and Future Scope</w:t>
+        <w:t>CHAPTER 6: CONCLUSION AND FUTURE SCOPE</w:t>
       </w:r>
     </w:p>
     <w:p>
@@ -601,7 +825,7 @@
     </w:p>
     <w:p>
       <w:r>
-        <w:t>The Attendance Management System provides a highly efficient, paperless solution for academic administration. By integrating modern web technologies, the system significantly reduces manual labor and provides instant actionable insights.</w:t>
+        <w:t>The Attendance Management System provides a highly efficient, cloud-based solution for academic administration. By integrating modern web technologies, the system significantly reduces manual labor, ensures data accuracy, and provides actionable insights.</w:t>
       </w:r>
     </w:p>
     <w:p>
@@ -610,7 +834,21 @@
         <w:jc w:val="left"/>
       </w:pPr>
       <w:r>
-        <w:t>6.2 Future Enhancements</w:t>
+        <w:t>6.2 Limitations</w:t>
+      </w:r>
+    </w:p>
+    <w:p>
+      <w:r>
+        <w:t>Currently, the system relies on manual inputs by the trainer, which still requires physical verification within the classroom.</w:t>
+      </w:r>
+    </w:p>
+    <w:p>
+      <w:pPr>
+        <w:pStyle w:val="Heading2"/>
+        <w:jc w:val="left"/>
+      </w:pPr>
+      <w:r>
+        <w:t>6.3 Future Enhancements</w:t>
       </w:r>
     </w:p>
     <w:p>
@@ -630,19 +868,19 @@
     <w:p>
       <w:pPr>
         <w:pStyle w:val="Heading1"/>
-        <w:jc w:val="left"/>
+        <w:jc w:val="center"/>
       </w:pPr>
       <w:r>
-        <w:t>References</w:t>
+        <w:t>REFERENCES</w:t>
       </w:r>
     </w:p>
     <w:p>
       <w:r>
-        <w:t>[1] Spring Framework Documentation. (2024). Spring Boot Reference Guide. [Online]. Available: https://spring.io/projects/spring-boot</w:t>
+        <w:t>[1] Spring Framework Documentation. "Spring Boot Reference Guide," 2024. [Online]. Available: https://spring.io/projects/spring-boot</w:t>
         <w:br/>
-        <w:t>[2] React Documentation. (2024). React: The library for web and native user interfaces. [Online]. Available: https://react.dev</w:t>
+        <w:t>[2] Meta Platforms, Inc. "React: The library for web and native user interfaces," 2024. [Online]. Available: https://react.dev</w:t>
         <w:br/>
-        <w:t>[3] PostgreSQL Global Development Group. (2024). PostgreSQL Documentation. [Online]. Available: https://www.postgresql.org/docs/</w:t>
+        <w:t>[3] PostgreSQL Global Development Group. "PostgreSQL 15 Documentation," 2024. [Online]. Available: https://www.postgresql.org/docs/</w:t>
       </w:r>
     </w:p>
     <w:p>
@@ -653,10 +891,10 @@
     <w:p>
       <w:pPr>
         <w:pStyle w:val="Heading1"/>
-        <w:jc w:val="left"/>
+        <w:jc w:val="center"/>
       </w:pPr>
       <w:r>
-        <w:t>Appendices</w:t>
+        <w:t>APPENDICES</w:t>
       </w:r>
     </w:p>
     <w:p>
@@ -673,7 +911,50 @@
         <w:t>The complete source code for this project is hosted on GitHub at: https://github.com/Ma-nas/Attandance-Managment-system</w:t>
       </w:r>
     </w:p>
+    <w:p>
+      <w:pPr>
+        <w:pStyle w:val="Heading2"/>
+        <w:jc w:val="left"/>
+      </w:pPr>
+      <w:r>
+        <w:t>Appendix B: User Manual</w:t>
+      </w:r>
+    </w:p>
+    <w:p>
+      <w:r>
+        <w:t>Admins can log in using their credentials to register new users. Trainers select their assigned class from a dropdown to initiate a session. Students log in to view their dashboard.</w:t>
+      </w:r>
+    </w:p>
+    <w:p>
+      <w:pPr>
+        <w:pStyle w:val="Heading2"/>
+        <w:jc w:val="left"/>
+      </w:pPr>
+      <w:r>
+        <w:t>Appendix C: Datasheets</w:t>
+      </w:r>
+    </w:p>
+    <w:p>
+      <w:r>
+        <w:t>Not applicable for software-only implementation.</w:t>
+      </w:r>
+    </w:p>
+    <w:p>
+      <w:pPr>
+        <w:pStyle w:val="Heading2"/>
+        <w:jc w:val="left"/>
+      </w:pPr>
+      <w:r>
+        <w:t>Appendix D: Additional Results</w:t>
+      </w:r>
+    </w:p>
+    <w:p>
+      <w:r>
+        <w:t>Stress test logs and API documentation (Swagger) are available in the repository.</w:t>
+      </w:r>
+    </w:p>
     <w:sectPr>
+      <w:footerReference w:type="default" r:id="rId9"/>
       <w:pgSz w:w="12240" w:h="15840"/>
       <w:pgMar w:top="1440" w:right="1440" w:bottom="1440" w:left="1440" w:header="720" w:footer="720" w:gutter="0"/>
       <w:cols w:space="720"/>
@@ -681,6 +962,23 @@
     </w:sectPr>
   </w:body>
 </w:document>
+</file>
+
+<file path=word/footer1.xml><?xml version="1.0" encoding="utf-8"?>
+<w:ftr xmlns:m="http://schemas.openxmlformats.org/officeDocument/2006/math" xmlns:mc="http://schemas.openxmlformats.org/markup-compatibility/2006" xmlns:mo="http://schemas.microsoft.com/office/mac/office/2008/main" xmlns:mv="urn:schemas-microsoft-com:mac:vml" xmlns:o="urn:schemas-microsoft-com:office:office" xmlns:r="http://schemas.openxmlformats.org/officeDocument/2006/relationships" xmlns:v="urn:schemas-microsoft-com:vml" xmlns:w10="urn:schemas-microsoft-com:office:word" xmlns:w14="http://schemas.microsoft.com/office/word/2010/wordml" xmlns:w="http://schemas.openxmlformats.org/wordprocessingml/2006/main" xmlns:wne="http://schemas.microsoft.com/office/word/2006/wordml" xmlns:wp14="http://schemas.microsoft.com/office/word/2010/wordprocessingDrawing" xmlns:wp="http://schemas.openxmlformats.org/drawingml/2006/wordprocessingDrawing" xmlns:wpc="http://schemas.microsoft.com/office/word/2010/wordprocessingCanvas" xmlns:wpg="http://schemas.microsoft.com/office/word/2010/wordprocessingGroup" xmlns:wpi="http://schemas.microsoft.com/office/word/2010/wordprocessingInk" xmlns:wps="http://schemas.microsoft.com/office/word/2010/wordprocessingShape" mc:Ignorable="w14 wp14">
+  <w:p>
+    <w:pPr>
+      <w:pStyle w:val="Footer"/>
+      <w:jc w:val="center"/>
+    </w:pPr>
+    <w:r>
+      <w:fldChar w:fldCharType="begin"/>
+      <w:instrText xml:space="preserve">PAGE</w:instrText>
+      <w:fldChar w:fldCharType="separate"/>
+      <w:fldChar w:fldCharType="end"/>
+    </w:r>
+  </w:p>
+</w:ftr>
 </file>
 
 <file path=word/numbering.xml><?xml version="1.0" encoding="utf-8"?>

</xml_diff>